<commit_message>
Remove pre-printed row numbers from support registry
Co-Authored-By: Claude Sonnet 5.5 <noreply@anthropic.com>
Claude-Session: https://claude.ai/code/session_01UXJwRVuw1nF5FgYr62S4Ys
</commit_message>
<xml_diff>
--- a/docs/reestr_podderzhki_A4.docx
+++ b/docs/reestr_podderzhki_A4.docx
@@ -159,9 +159,7 @@
             <w:tcW w:type="dxa" w:w="850"/>
           </w:tcPr>
           <w:p>
-            <w:r>
-              <w:t>1</w:t>
-            </w:r>
+            <w:r/>
           </w:p>
         </w:tc>
         <w:tc>
@@ -198,9 +196,7 @@
             <w:tcW w:type="dxa" w:w="850"/>
           </w:tcPr>
           <w:p>
-            <w:r>
-              <w:t>2</w:t>
-            </w:r>
+            <w:r/>
           </w:p>
         </w:tc>
         <w:tc>
@@ -237,9 +233,7 @@
             <w:tcW w:type="dxa" w:w="850"/>
           </w:tcPr>
           <w:p>
-            <w:r>
-              <w:t>3</w:t>
-            </w:r>
+            <w:r/>
           </w:p>
         </w:tc>
         <w:tc>
@@ -276,9 +270,7 @@
             <w:tcW w:type="dxa" w:w="850"/>
           </w:tcPr>
           <w:p>
-            <w:r>
-              <w:t>4</w:t>
-            </w:r>
+            <w:r/>
           </w:p>
         </w:tc>
         <w:tc>
@@ -315,9 +307,7 @@
             <w:tcW w:type="dxa" w:w="850"/>
           </w:tcPr>
           <w:p>
-            <w:r>
-              <w:t>5</w:t>
-            </w:r>
+            <w:r/>
           </w:p>
         </w:tc>
         <w:tc>
@@ -354,9 +344,7 @@
             <w:tcW w:type="dxa" w:w="850"/>
           </w:tcPr>
           <w:p>
-            <w:r>
-              <w:t>6</w:t>
-            </w:r>
+            <w:r/>
           </w:p>
         </w:tc>
         <w:tc>
@@ -393,9 +381,7 @@
             <w:tcW w:type="dxa" w:w="850"/>
           </w:tcPr>
           <w:p>
-            <w:r>
-              <w:t>7</w:t>
-            </w:r>
+            <w:r/>
           </w:p>
         </w:tc>
         <w:tc>
@@ -432,9 +418,7 @@
             <w:tcW w:type="dxa" w:w="850"/>
           </w:tcPr>
           <w:p>
-            <w:r>
-              <w:t>8</w:t>
-            </w:r>
+            <w:r/>
           </w:p>
         </w:tc>
         <w:tc>
@@ -471,9 +455,7 @@
             <w:tcW w:type="dxa" w:w="850"/>
           </w:tcPr>
           <w:p>
-            <w:r>
-              <w:t>9</w:t>
-            </w:r>
+            <w:r/>
           </w:p>
         </w:tc>
         <w:tc>
@@ -510,9 +492,7 @@
             <w:tcW w:type="dxa" w:w="850"/>
           </w:tcPr>
           <w:p>
-            <w:r>
-              <w:t>10</w:t>
-            </w:r>
+            <w:r/>
           </w:p>
         </w:tc>
         <w:tc>
@@ -549,9 +529,7 @@
             <w:tcW w:type="dxa" w:w="850"/>
           </w:tcPr>
           <w:p>
-            <w:r>
-              <w:t>11</w:t>
-            </w:r>
+            <w:r/>
           </w:p>
         </w:tc>
         <w:tc>
@@ -588,9 +566,7 @@
             <w:tcW w:type="dxa" w:w="850"/>
           </w:tcPr>
           <w:p>
-            <w:r>
-              <w:t>12</w:t>
-            </w:r>
+            <w:r/>
           </w:p>
         </w:tc>
         <w:tc>
@@ -781,9 +757,7 @@
             <w:tcW w:type="dxa" w:w="850"/>
           </w:tcPr>
           <w:p>
-            <w:r>
-              <w:t>13</w:t>
-            </w:r>
+            <w:r/>
           </w:p>
         </w:tc>
         <w:tc>
@@ -820,9 +794,7 @@
             <w:tcW w:type="dxa" w:w="850"/>
           </w:tcPr>
           <w:p>
-            <w:r>
-              <w:t>14</w:t>
-            </w:r>
+            <w:r/>
           </w:p>
         </w:tc>
         <w:tc>
@@ -859,9 +831,7 @@
             <w:tcW w:type="dxa" w:w="850"/>
           </w:tcPr>
           <w:p>
-            <w:r>
-              <w:t>15</w:t>
-            </w:r>
+            <w:r/>
           </w:p>
         </w:tc>
         <w:tc>
@@ -898,9 +868,7 @@
             <w:tcW w:type="dxa" w:w="850"/>
           </w:tcPr>
           <w:p>
-            <w:r>
-              <w:t>16</w:t>
-            </w:r>
+            <w:r/>
           </w:p>
         </w:tc>
         <w:tc>
@@ -937,9 +905,7 @@
             <w:tcW w:type="dxa" w:w="850"/>
           </w:tcPr>
           <w:p>
-            <w:r>
-              <w:t>17</w:t>
-            </w:r>
+            <w:r/>
           </w:p>
         </w:tc>
         <w:tc>
@@ -976,9 +942,7 @@
             <w:tcW w:type="dxa" w:w="850"/>
           </w:tcPr>
           <w:p>
-            <w:r>
-              <w:t>18</w:t>
-            </w:r>
+            <w:r/>
           </w:p>
         </w:tc>
         <w:tc>
@@ -1015,9 +979,7 @@
             <w:tcW w:type="dxa" w:w="850"/>
           </w:tcPr>
           <w:p>
-            <w:r>
-              <w:t>19</w:t>
-            </w:r>
+            <w:r/>
           </w:p>
         </w:tc>
         <w:tc>
@@ -1054,9 +1016,7 @@
             <w:tcW w:type="dxa" w:w="850"/>
           </w:tcPr>
           <w:p>
-            <w:r>
-              <w:t>20</w:t>
-            </w:r>
+            <w:r/>
           </w:p>
         </w:tc>
         <w:tc>
@@ -1093,9 +1053,7 @@
             <w:tcW w:type="dxa" w:w="850"/>
           </w:tcPr>
           <w:p>
-            <w:r>
-              <w:t>21</w:t>
-            </w:r>
+            <w:r/>
           </w:p>
         </w:tc>
         <w:tc>
@@ -1132,9 +1090,7 @@
             <w:tcW w:type="dxa" w:w="850"/>
           </w:tcPr>
           <w:p>
-            <w:r>
-              <w:t>22</w:t>
-            </w:r>
+            <w:r/>
           </w:p>
         </w:tc>
         <w:tc>
@@ -1171,9 +1127,7 @@
             <w:tcW w:type="dxa" w:w="850"/>
           </w:tcPr>
           <w:p>
-            <w:r>
-              <w:t>23</w:t>
-            </w:r>
+            <w:r/>
           </w:p>
         </w:tc>
         <w:tc>
@@ -1210,9 +1164,7 @@
             <w:tcW w:type="dxa" w:w="850"/>
           </w:tcPr>
           <w:p>
-            <w:r>
-              <w:t>24</w:t>
-            </w:r>
+            <w:r/>
           </w:p>
         </w:tc>
         <w:tc>
@@ -1403,9 +1355,7 @@
             <w:tcW w:type="dxa" w:w="850"/>
           </w:tcPr>
           <w:p>
-            <w:r>
-              <w:t>25</w:t>
-            </w:r>
+            <w:r/>
           </w:p>
         </w:tc>
         <w:tc>
@@ -1442,9 +1392,7 @@
             <w:tcW w:type="dxa" w:w="850"/>
           </w:tcPr>
           <w:p>
-            <w:r>
-              <w:t>26</w:t>
-            </w:r>
+            <w:r/>
           </w:p>
         </w:tc>
         <w:tc>
@@ -1481,9 +1429,7 @@
             <w:tcW w:type="dxa" w:w="850"/>
           </w:tcPr>
           <w:p>
-            <w:r>
-              <w:t>27</w:t>
-            </w:r>
+            <w:r/>
           </w:p>
         </w:tc>
         <w:tc>
@@ -1520,9 +1466,7 @@
             <w:tcW w:type="dxa" w:w="850"/>
           </w:tcPr>
           <w:p>
-            <w:r>
-              <w:t>28</w:t>
-            </w:r>
+            <w:r/>
           </w:p>
         </w:tc>
         <w:tc>
@@ -1559,9 +1503,7 @@
             <w:tcW w:type="dxa" w:w="850"/>
           </w:tcPr>
           <w:p>
-            <w:r>
-              <w:t>29</w:t>
-            </w:r>
+            <w:r/>
           </w:p>
         </w:tc>
         <w:tc>
@@ -1598,9 +1540,7 @@
             <w:tcW w:type="dxa" w:w="850"/>
           </w:tcPr>
           <w:p>
-            <w:r>
-              <w:t>30</w:t>
-            </w:r>
+            <w:r/>
           </w:p>
         </w:tc>
         <w:tc>
@@ -1637,9 +1577,7 @@
             <w:tcW w:type="dxa" w:w="850"/>
           </w:tcPr>
           <w:p>
-            <w:r>
-              <w:t>31</w:t>
-            </w:r>
+            <w:r/>
           </w:p>
         </w:tc>
         <w:tc>
@@ -1676,9 +1614,7 @@
             <w:tcW w:type="dxa" w:w="850"/>
           </w:tcPr>
           <w:p>
-            <w:r>
-              <w:t>32</w:t>
-            </w:r>
+            <w:r/>
           </w:p>
         </w:tc>
         <w:tc>
@@ -1715,9 +1651,7 @@
             <w:tcW w:type="dxa" w:w="850"/>
           </w:tcPr>
           <w:p>
-            <w:r>
-              <w:t>33</w:t>
-            </w:r>
+            <w:r/>
           </w:p>
         </w:tc>
         <w:tc>
@@ -1754,9 +1688,7 @@
             <w:tcW w:type="dxa" w:w="850"/>
           </w:tcPr>
           <w:p>
-            <w:r>
-              <w:t>34</w:t>
-            </w:r>
+            <w:r/>
           </w:p>
         </w:tc>
         <w:tc>
@@ -1793,9 +1725,7 @@
             <w:tcW w:type="dxa" w:w="850"/>
           </w:tcPr>
           <w:p>
-            <w:r>
-              <w:t>35</w:t>
-            </w:r>
+            <w:r/>
           </w:p>
         </w:tc>
         <w:tc>
@@ -1832,9 +1762,7 @@
             <w:tcW w:type="dxa" w:w="850"/>
           </w:tcPr>
           <w:p>
-            <w:r>
-              <w:t>36</w:t>
-            </w:r>
+            <w:r/>
           </w:p>
         </w:tc>
         <w:tc>
@@ -2025,9 +1953,7 @@
             <w:tcW w:type="dxa" w:w="850"/>
           </w:tcPr>
           <w:p>
-            <w:r>
-              <w:t>37</w:t>
-            </w:r>
+            <w:r/>
           </w:p>
         </w:tc>
         <w:tc>
@@ -2064,9 +1990,7 @@
             <w:tcW w:type="dxa" w:w="850"/>
           </w:tcPr>
           <w:p>
-            <w:r>
-              <w:t>38</w:t>
-            </w:r>
+            <w:r/>
           </w:p>
         </w:tc>
         <w:tc>
@@ -2103,9 +2027,7 @@
             <w:tcW w:type="dxa" w:w="850"/>
           </w:tcPr>
           <w:p>
-            <w:r>
-              <w:t>39</w:t>
-            </w:r>
+            <w:r/>
           </w:p>
         </w:tc>
         <w:tc>
@@ -2142,9 +2064,7 @@
             <w:tcW w:type="dxa" w:w="850"/>
           </w:tcPr>
           <w:p>
-            <w:r>
-              <w:t>40</w:t>
-            </w:r>
+            <w:r/>
           </w:p>
         </w:tc>
         <w:tc>
@@ -2181,9 +2101,7 @@
             <w:tcW w:type="dxa" w:w="850"/>
           </w:tcPr>
           <w:p>
-            <w:r>
-              <w:t>41</w:t>
-            </w:r>
+            <w:r/>
           </w:p>
         </w:tc>
         <w:tc>
@@ -2220,9 +2138,7 @@
             <w:tcW w:type="dxa" w:w="850"/>
           </w:tcPr>
           <w:p>
-            <w:r>
-              <w:t>42</w:t>
-            </w:r>
+            <w:r/>
           </w:p>
         </w:tc>
         <w:tc>
@@ -2259,9 +2175,7 @@
             <w:tcW w:type="dxa" w:w="850"/>
           </w:tcPr>
           <w:p>
-            <w:r>
-              <w:t>43</w:t>
-            </w:r>
+            <w:r/>
           </w:p>
         </w:tc>
         <w:tc>
@@ -2298,9 +2212,7 @@
             <w:tcW w:type="dxa" w:w="850"/>
           </w:tcPr>
           <w:p>
-            <w:r>
-              <w:t>44</w:t>
-            </w:r>
+            <w:r/>
           </w:p>
         </w:tc>
         <w:tc>
@@ -2337,9 +2249,7 @@
             <w:tcW w:type="dxa" w:w="850"/>
           </w:tcPr>
           <w:p>
-            <w:r>
-              <w:t>45</w:t>
-            </w:r>
+            <w:r/>
           </w:p>
         </w:tc>
         <w:tc>
@@ -2376,9 +2286,7 @@
             <w:tcW w:type="dxa" w:w="850"/>
           </w:tcPr>
           <w:p>
-            <w:r>
-              <w:t>46</w:t>
-            </w:r>
+            <w:r/>
           </w:p>
         </w:tc>
         <w:tc>
@@ -2415,9 +2323,7 @@
             <w:tcW w:type="dxa" w:w="850"/>
           </w:tcPr>
           <w:p>
-            <w:r>
-              <w:t>47</w:t>
-            </w:r>
+            <w:r/>
           </w:p>
         </w:tc>
         <w:tc>
@@ -2454,9 +2360,7 @@
             <w:tcW w:type="dxa" w:w="850"/>
           </w:tcPr>
           <w:p>
-            <w:r>
-              <w:t>48</w:t>
-            </w:r>
+            <w:r/>
           </w:p>
         </w:tc>
         <w:tc>
@@ -2647,9 +2551,7 @@
             <w:tcW w:type="dxa" w:w="850"/>
           </w:tcPr>
           <w:p>
-            <w:r>
-              <w:t>49</w:t>
-            </w:r>
+            <w:r/>
           </w:p>
         </w:tc>
         <w:tc>
@@ -2686,9 +2588,7 @@
             <w:tcW w:type="dxa" w:w="850"/>
           </w:tcPr>
           <w:p>
-            <w:r>
-              <w:t>50</w:t>
-            </w:r>
+            <w:r/>
           </w:p>
         </w:tc>
         <w:tc>
@@ -2725,9 +2625,7 @@
             <w:tcW w:type="dxa" w:w="850"/>
           </w:tcPr>
           <w:p>
-            <w:r>
-              <w:t>51</w:t>
-            </w:r>
+            <w:r/>
           </w:p>
         </w:tc>
         <w:tc>
@@ -2764,9 +2662,7 @@
             <w:tcW w:type="dxa" w:w="850"/>
           </w:tcPr>
           <w:p>
-            <w:r>
-              <w:t>52</w:t>
-            </w:r>
+            <w:r/>
           </w:p>
         </w:tc>
         <w:tc>
@@ -2803,9 +2699,7 @@
             <w:tcW w:type="dxa" w:w="850"/>
           </w:tcPr>
           <w:p>
-            <w:r>
-              <w:t>53</w:t>
-            </w:r>
+            <w:r/>
           </w:p>
         </w:tc>
         <w:tc>
@@ -2842,9 +2736,7 @@
             <w:tcW w:type="dxa" w:w="850"/>
           </w:tcPr>
           <w:p>
-            <w:r>
-              <w:t>54</w:t>
-            </w:r>
+            <w:r/>
           </w:p>
         </w:tc>
         <w:tc>
@@ -2881,9 +2773,7 @@
             <w:tcW w:type="dxa" w:w="850"/>
           </w:tcPr>
           <w:p>
-            <w:r>
-              <w:t>55</w:t>
-            </w:r>
+            <w:r/>
           </w:p>
         </w:tc>
         <w:tc>
@@ -2920,9 +2810,7 @@
             <w:tcW w:type="dxa" w:w="850"/>
           </w:tcPr>
           <w:p>
-            <w:r>
-              <w:t>56</w:t>
-            </w:r>
+            <w:r/>
           </w:p>
         </w:tc>
         <w:tc>
@@ -2959,9 +2847,7 @@
             <w:tcW w:type="dxa" w:w="850"/>
           </w:tcPr>
           <w:p>
-            <w:r>
-              <w:t>57</w:t>
-            </w:r>
+            <w:r/>
           </w:p>
         </w:tc>
         <w:tc>
@@ -2998,9 +2884,7 @@
             <w:tcW w:type="dxa" w:w="850"/>
           </w:tcPr>
           <w:p>
-            <w:r>
-              <w:t>58</w:t>
-            </w:r>
+            <w:r/>
           </w:p>
         </w:tc>
         <w:tc>
@@ -3037,9 +2921,7 @@
             <w:tcW w:type="dxa" w:w="850"/>
           </w:tcPr>
           <w:p>
-            <w:r>
-              <w:t>59</w:t>
-            </w:r>
+            <w:r/>
           </w:p>
         </w:tc>
         <w:tc>
@@ -3076,9 +2958,7 @@
             <w:tcW w:type="dxa" w:w="850"/>
           </w:tcPr>
           <w:p>
-            <w:r>
-              <w:t>60</w:t>
-            </w:r>
+            <w:r/>
           </w:p>
         </w:tc>
         <w:tc>
@@ -3269,9 +3149,7 @@
             <w:tcW w:type="dxa" w:w="850"/>
           </w:tcPr>
           <w:p>
-            <w:r>
-              <w:t>61</w:t>
-            </w:r>
+            <w:r/>
           </w:p>
         </w:tc>
         <w:tc>
@@ -3308,9 +3186,7 @@
             <w:tcW w:type="dxa" w:w="850"/>
           </w:tcPr>
           <w:p>
-            <w:r>
-              <w:t>62</w:t>
-            </w:r>
+            <w:r/>
           </w:p>
         </w:tc>
         <w:tc>
@@ -3347,9 +3223,7 @@
             <w:tcW w:type="dxa" w:w="850"/>
           </w:tcPr>
           <w:p>
-            <w:r>
-              <w:t>63</w:t>
-            </w:r>
+            <w:r/>
           </w:p>
         </w:tc>
         <w:tc>
@@ -3386,9 +3260,7 @@
             <w:tcW w:type="dxa" w:w="850"/>
           </w:tcPr>
           <w:p>
-            <w:r>
-              <w:t>64</w:t>
-            </w:r>
+            <w:r/>
           </w:p>
         </w:tc>
         <w:tc>
@@ -3425,9 +3297,7 @@
             <w:tcW w:type="dxa" w:w="850"/>
           </w:tcPr>
           <w:p>
-            <w:r>
-              <w:t>65</w:t>
-            </w:r>
+            <w:r/>
           </w:p>
         </w:tc>
         <w:tc>
@@ -3464,9 +3334,7 @@
             <w:tcW w:type="dxa" w:w="850"/>
           </w:tcPr>
           <w:p>
-            <w:r>
-              <w:t>66</w:t>
-            </w:r>
+            <w:r/>
           </w:p>
         </w:tc>
         <w:tc>
@@ -3503,9 +3371,7 @@
             <w:tcW w:type="dxa" w:w="850"/>
           </w:tcPr>
           <w:p>
-            <w:r>
-              <w:t>67</w:t>
-            </w:r>
+            <w:r/>
           </w:p>
         </w:tc>
         <w:tc>
@@ -3542,9 +3408,7 @@
             <w:tcW w:type="dxa" w:w="850"/>
           </w:tcPr>
           <w:p>
-            <w:r>
-              <w:t>68</w:t>
-            </w:r>
+            <w:r/>
           </w:p>
         </w:tc>
         <w:tc>
@@ -3581,9 +3445,7 @@
             <w:tcW w:type="dxa" w:w="850"/>
           </w:tcPr>
           <w:p>
-            <w:r>
-              <w:t>69</w:t>
-            </w:r>
+            <w:r/>
           </w:p>
         </w:tc>
         <w:tc>
@@ -3620,9 +3482,7 @@
             <w:tcW w:type="dxa" w:w="850"/>
           </w:tcPr>
           <w:p>
-            <w:r>
-              <w:t>70</w:t>
-            </w:r>
+            <w:r/>
           </w:p>
         </w:tc>
         <w:tc>
@@ -3659,9 +3519,7 @@
             <w:tcW w:type="dxa" w:w="850"/>
           </w:tcPr>
           <w:p>
-            <w:r>
-              <w:t>71</w:t>
-            </w:r>
+            <w:r/>
           </w:p>
         </w:tc>
         <w:tc>
@@ -3698,9 +3556,7 @@
             <w:tcW w:type="dxa" w:w="850"/>
           </w:tcPr>
           <w:p>
-            <w:r>
-              <w:t>72</w:t>
-            </w:r>
+            <w:r/>
           </w:p>
         </w:tc>
         <w:tc>

</xml_diff>

<commit_message>
Remove sheet numbering from support registry
Co-Authored-By: Claude Sonnet 5.5 <noreply@anthropic.com>
Claude-Session: https://claude.ai/code/session_01UXJwRVuw1nF5FgYr62S4Ys
</commit_message>
<xml_diff>
--- a/docs/reestr_podderzhki_A4.docx
+++ b/docs/reestr_podderzhki_A4.docx
@@ -39,19 +39,6 @@
           <w:sz w:val="22"/>
         </w:rPr>
         <w:t>Инициативный проект «Места хватит всем 1.0» — создание парковки общего пользования по ул. Магистральной, 2 в Советском АО г. Омска</w:t>
-      </w:r>
-    </w:p>
-    <w:p>
-      <w:pPr>
-        <w:spacing w:after="40"/>
-        <w:jc w:val="right"/>
-      </w:pPr>
-      <w:r>
-        <w:rPr>
-          <w:b w:val="0"/>
-          <w:sz w:val="20"/>
-        </w:rPr>
-        <w:t>Лист 1 из 6</w:t>
       </w:r>
     </w:p>
     <w:tbl>
@@ -639,19 +626,6 @@
         <w:t>Инициативный проект «Места хватит всем 1.0» — создание парковки общего пользования по ул. Магистральной, 2 в Советском АО г. Омска</w:t>
       </w:r>
     </w:p>
-    <w:p>
-      <w:pPr>
-        <w:spacing w:after="40"/>
-        <w:jc w:val="right"/>
-      </w:pPr>
-      <w:r>
-        <w:rPr>
-          <w:b w:val="0"/>
-          <w:sz w:val="20"/>
-        </w:rPr>
-        <w:t>Лист 2 из 6</w:t>
-      </w:r>
-    </w:p>
     <w:tbl>
       <w:tblPr>
         <w:tblStyle w:val="TableGrid"/>
@@ -1237,19 +1211,6 @@
         <w:t>Инициативный проект «Места хватит всем 1.0» — создание парковки общего пользования по ул. Магистральной, 2 в Советском АО г. Омска</w:t>
       </w:r>
     </w:p>
-    <w:p>
-      <w:pPr>
-        <w:spacing w:after="40"/>
-        <w:jc w:val="right"/>
-      </w:pPr>
-      <w:r>
-        <w:rPr>
-          <w:b w:val="0"/>
-          <w:sz w:val="20"/>
-        </w:rPr>
-        <w:t>Лист 3 из 6</w:t>
-      </w:r>
-    </w:p>
     <w:tbl>
       <w:tblPr>
         <w:tblStyle w:val="TableGrid"/>
@@ -1835,19 +1796,6 @@
         <w:t>Инициативный проект «Места хватит всем 1.0» — создание парковки общего пользования по ул. Магистральной, 2 в Советском АО г. Омска</w:t>
       </w:r>
     </w:p>
-    <w:p>
-      <w:pPr>
-        <w:spacing w:after="40"/>
-        <w:jc w:val="right"/>
-      </w:pPr>
-      <w:r>
-        <w:rPr>
-          <w:b w:val="0"/>
-          <w:sz w:val="20"/>
-        </w:rPr>
-        <w:t>Лист 4 из 6</w:t>
-      </w:r>
-    </w:p>
     <w:tbl>
       <w:tblPr>
         <w:tblStyle w:val="TableGrid"/>
@@ -2433,19 +2381,6 @@
         <w:t>Инициативный проект «Места хватит всем 1.0» — создание парковки общего пользования по ул. Магистральной, 2 в Советском АО г. Омска</w:t>
       </w:r>
     </w:p>
-    <w:p>
-      <w:pPr>
-        <w:spacing w:after="40"/>
-        <w:jc w:val="right"/>
-      </w:pPr>
-      <w:r>
-        <w:rPr>
-          <w:b w:val="0"/>
-          <w:sz w:val="20"/>
-        </w:rPr>
-        <w:t>Лист 5 из 6</w:t>
-      </w:r>
-    </w:p>
     <w:tbl>
       <w:tblPr>
         <w:tblStyle w:val="TableGrid"/>
@@ -3029,19 +2964,6 @@
           <w:sz w:val="22"/>
         </w:rPr>
         <w:t>Инициативный проект «Места хватит всем 1.0» — создание парковки общего пользования по ул. Магистральной, 2 в Советском АО г. Омска</w:t>
-      </w:r>
-    </w:p>
-    <w:p>
-      <w:pPr>
-        <w:spacing w:after="40"/>
-        <w:jc w:val="right"/>
-      </w:pPr>
-      <w:r>
-        <w:rPr>
-          <w:b w:val="0"/>
-          <w:sz w:val="20"/>
-        </w:rPr>
-        <w:t>Лист 6 из 6</w:t>
       </w:r>
     </w:p>
     <w:tbl>

</xml_diff>